<commit_message>
Chinh sua loi mo nhieu cua so
</commit_message>
<xml_diff>
--- a/Báo cáo sản phẩm.docx
+++ b/Báo cáo sản phẩm.docx
@@ -262,7 +262,14 @@
                 <w:b/>
                 <w:i/>
               </w:rPr>
-              <w:t>- Nguyễn Hồng Sơn</w:t>
+              <w:t xml:space="preserve">- Nguyễn Hồng </w:t>
+            </w:r>
+            <w:r>
+              <w:rPr>
+                <w:b/>
+                <w:i/>
+              </w:rPr>
+              <w:t>Quân</w:t>
             </w:r>
           </w:p>
           <w:p>
@@ -3326,13 +3333,7 @@
         <w:t xml:space="preserve">: </w:t>
       </w:r>
       <w:r>
-        <w:t xml:space="preserve">Node.js là một công cụ cho phép lập trình viên chạy mã JavaScript bên ngoài trình duyệt, tức là trên máy chủ. Điều này có nghĩa là </w:t>
-      </w:r>
-      <w:r>
-        <w:t>lập trình viên</w:t>
-      </w:r>
-      <w:r>
-        <w:t xml:space="preserve"> có thể xây dựng các ứng dụng web, tạo ra nội dung động trước khi gửi đến trình duyệt của người dùng.</w:t>
+        <w:t>Node.js là một công cụ cho phép lập trình viên chạy mã JavaScript bên ngoài trình duyệt, tức là trên máy chủ. Điều này có nghĩa là lập trình viên có thể xây dựng các ứng dụng web, tạo ra nội dung động trước khi gửi đến trình duyệt của người dùng.</w:t>
       </w:r>
     </w:p>
     <w:p>
@@ -3439,10 +3440,7 @@
         <w:t xml:space="preserve"> </w:t>
       </w:r>
       <w:r>
-        <w:t>là một nền tảng trực tuyến cho phép lập trình viên lưu trữ, quản lý và chia sẻ mã nguồn của họ. Nó sử dụng hệ thống kiểm soát phiên bản Git, giúp người dùng theo dõi thay đổi trong mã và làm việc cùng nhau trên các dự án phần mềm. GitHub cũng cung cấp các tính năng như báo cáo lỗi, yêu cầu tính năng, và hợp tác qua pull request, tạo điều kiện cho việc phát triển phần mềm hiệu quả hơn.</w:t>
-      </w:r>
-      <w:r>
-        <w:t xml:space="preserve"> Gith</w:t>
+        <w:t>là một nền tảng trực tuyến cho phép lập trình viên lưu trữ, quản lý và chia sẻ mã nguồn của họ. Nó sử dụng hệ thống kiểm soát phiên bản Git, giúp người dùng theo dõi thay đổi trong mã và làm việc cùng nhau trên các dự án phần mềm. GitHub cũng cung cấp các tính năng như báo cáo lỗi, yêu cầu tính năng, và hợp tác qua pull request, tạo điều kiện cho việc phát triển phần mềm hiệu quả hơn. Gith</w:t>
       </w:r>
       <w:r>
         <w:t>ub giúp nhóm nghiên cứu lưu trữ và phát triển mã nguồn.</w:t>
@@ -3493,13 +3491,7 @@
         <w:rPr>
           <w:lang w:val="vi-VN"/>
         </w:rPr>
-        <w:t>Visual Studio Code</w:t>
-      </w:r>
-      <w:r>
-        <w:rPr>
-          <w:lang w:val="vi-VN"/>
-        </w:rPr>
-        <w:t xml:space="preserve"> </w:t>
+        <w:t xml:space="preserve">Visual Studio Code </w:t>
       </w:r>
       <w:r>
         <w:rPr>
@@ -3793,6 +3785,9 @@
     <w:p>
       <w:pPr>
         <w:pStyle w:val="Heading4"/>
+        <w:rPr>
+          <w:rFonts w:hint="eastAsia"/>
+        </w:rPr>
       </w:pPr>
       <w:r>
         <w:t>Xây dựng Render Proccess</w:t>
@@ -3803,10 +3798,7 @@
         <w:pStyle w:val="Heading5"/>
       </w:pPr>
       <w:r>
-        <w:t xml:space="preserve">Kế thừa giao diện </w:t>
-      </w:r>
-      <w:r>
-        <w:t>Gomoku Calc</w:t>
+        <w:t>Kế thừa giao diện Gomoku Calc</w:t>
       </w:r>
     </w:p>
     <w:p>
@@ -3820,54 +3812,24 @@
         <w:t xml:space="preserve">. </w:t>
       </w:r>
       <w:r>
-        <w:t>Gomoku Calc là một ứng dụng</w:t>
-      </w:r>
-      <w:r>
-        <w:t xml:space="preserve"> được phát triển bởi tác giả </w:t>
+        <w:t xml:space="preserve">Gomoku Calc là một ứng dụng được phát triển bởi tác giả </w:t>
       </w:r>
       <w:r>
         <w:t>dhbloo</w:t>
       </w:r>
       <w:r>
-        <w:t xml:space="preserve"> (dblue)</w:t>
-      </w:r>
-      <w:r>
-        <w:t xml:space="preserve"> dùng để chơi và phân tích gomoku với sự hỗ trợ của AI, cho phép người dùng chơi với AI và cung cấp phân tích chi tiết các vị trí cờ. Ứng dụng sử dụng AI Rapfi (</w:t>
+        <w:t xml:space="preserve"> (dblue) dùng để chơi và phân tích gomoku với sự hỗ trợ của AI, cho phép người dùng chơi với AI và cung cấp phân tích chi tiết các vị trí cờ. Ứng dụng sử dụng AI Rapfi (</w:t>
       </w:r>
       <w:r>
         <w:t xml:space="preserve">cùng tác giả, </w:t>
       </w:r>
       <w:r>
-        <w:t xml:space="preserve">đã tham gia Gomocup 2021) với công nghệ web-assembly để đạt hiệu suất cao mà không cần kết nối máy chủ, hỗ trợ các </w:t>
-      </w:r>
-      <w:r>
-        <w:t xml:space="preserve">luật chơi </w:t>
-      </w:r>
-      <w:r>
-        <w:t>như "Gomoku tự do"</w:t>
-      </w:r>
-      <w:r>
-        <w:t xml:space="preserve"> (thắng khi có từ 5 quân thẳng hàng trở lên)</w:t>
-      </w:r>
-      <w:r>
-        <w:t>, "Gomoku tiêu chuẩn"</w:t>
-      </w:r>
-      <w:r>
-        <w:t xml:space="preserve"> (thắng khi có đúng 5 quân thẳng hàng)</w:t>
-      </w:r>
-      <w:r>
-        <w:t>, "Renju tự do", và "Gomoku tự do - SWAP1".</w:t>
-      </w:r>
-    </w:p>
-    <w:p>
-      <w:r>
-        <w:t xml:space="preserve">Dự án </w:t>
-      </w:r>
-      <w:r>
-        <w:t>Gomoku Calc</w:t>
-      </w:r>
-      <w:r>
-        <w:t xml:space="preserve"> được phát triển bằng framework Vue.js. Do mã nguồn được cập nhật lần mới nhất từ 2 năm trước nên phiên bản Node.js mà dự án tương thích là phiên bản 10. Để cài đặt lại môi trường phát triển </w:t>
+        <w:t>đã tham gia Gomocup 2021) với công nghệ web-assembly để đạt hiệu suất cao mà không cần kết nối máy chủ, hỗ trợ các luật chơi như "Gomoku tự do" (thắng khi có từ 5 quân thẳng hàng trở lên), "Gomoku tiêu chuẩn" (thắng khi có đúng 5 quân thẳng hàng), "Renju tự do", và "Gomoku tự do - SWAP1".</w:t>
+      </w:r>
+    </w:p>
+    <w:p>
+      <w:r>
+        <w:t xml:space="preserve">Dự án Gomoku Calc được phát triển bằng framework Vue.js. Do mã nguồn được cập nhật lần mới nhất từ 2 năm trước nên phiên bản Node.js mà dự án tương thích là phiên bản 10. Để cài đặt lại môi trường phát triển </w:t>
       </w:r>
       <w:r>
         <w:t>phù hợp trước khi chỉnh sửa lại giao diện, nhóm nghiên cứu đã sử dụng nvm (</w:t>
@@ -3920,6 +3882,9 @@
         <w:pStyle w:val="Hnhnh"/>
       </w:pPr>
       <w:r>
+        <w:rPr>
+          <w:noProof/>
+        </w:rPr>
         <w:drawing>
           <wp:inline distT="0" distB="0" distL="0" distR="0" wp14:anchorId="38D3B6F1" wp14:editId="4060B1DD">
             <wp:extent cx="3594100" cy="1219200"/>
@@ -3992,13 +3957,7 @@
         <w:t>vue-cli-service serve</w:t>
       </w:r>
       <w:r>
-        <w:t xml:space="preserve"> để khởi tạo giao diện </w:t>
-      </w:r>
-      <w:r>
-        <w:t>Gomoku Calc</w:t>
-      </w:r>
-      <w:r>
-        <w:t xml:space="preserve"> trong chế độ phát triên. Các thay đổi trong mã nguồn sẽ được cập nhật trực tiếp tại địa chỉ </w:t>
+        <w:t xml:space="preserve"> để khởi tạo giao diện Gomoku Calc trong chế độ phát triên. Các thay đổi trong mã nguồn sẽ được cập nhật trực tiếp tại địa chỉ </w:t>
       </w:r>
       <w:r>
         <w:t>http://localhost:8080</w:t>
@@ -4021,6 +3980,9 @@
         <w:pStyle w:val="Hnhnh"/>
       </w:pPr>
       <w:r>
+        <w:rPr>
+          <w:noProof/>
+        </w:rPr>
         <w:drawing>
           <wp:inline distT="0" distB="0" distL="0" distR="0" wp14:anchorId="28D965DF" wp14:editId="3986733D">
             <wp:extent cx="1854200" cy="2400300"/>
@@ -4092,6 +4054,9 @@
         <w:pStyle w:val="Hnhnh"/>
       </w:pPr>
       <w:r>
+        <w:rPr>
+          <w:noProof/>
+        </w:rPr>
         <w:drawing>
           <wp:inline distT="0" distB="0" distL="0" distR="0" wp14:anchorId="2BC37847" wp14:editId="0867A969">
             <wp:extent cx="5397500" cy="2921000"/>
@@ -4218,6 +4183,9 @@
         <w:keepNext/>
       </w:pPr>
       <w:r>
+        <w:rPr>
+          <w:noProof/>
+        </w:rPr>
         <w:drawing>
           <wp:inline distT="0" distB="0" distL="0" distR="0" wp14:anchorId="05F17189" wp14:editId="7F97854B">
             <wp:extent cx="5080000" cy="3835400"/>
@@ -4258,9 +4226,6 @@
     <w:p>
       <w:pPr>
         <w:pStyle w:val="Caption"/>
-        <w:rPr>
-          <w:rFonts w:hint="eastAsia"/>
-        </w:rPr>
       </w:pPr>
       <w:bookmarkStart w:id="13" w:name="_Toc179883184"/>
       <w:r>
@@ -4304,6 +4269,9 @@
         <w:keepNext/>
       </w:pPr>
       <w:r>
+        <w:rPr>
+          <w:noProof/>
+        </w:rPr>
         <w:lastRenderedPageBreak/>
         <w:drawing>
           <wp:inline distT="0" distB="0" distL="0" distR="0" wp14:anchorId="2735E77C" wp14:editId="5EE9206B">
@@ -4642,6 +4610,9 @@
         <w:keepNext/>
       </w:pPr>
       <w:r>
+        <w:rPr>
+          <w:noProof/>
+        </w:rPr>
         <w:drawing>
           <wp:inline distT="0" distB="0" distL="0" distR="0" wp14:anchorId="6B3778E2" wp14:editId="1937640F">
             <wp:extent cx="3365500" cy="2400300"/>
@@ -4783,6 +4754,9 @@
     <w:p>
       <w:pPr>
         <w:pStyle w:val="Heading4"/>
+        <w:rPr>
+          <w:rFonts w:hint="eastAsia"/>
+        </w:rPr>
       </w:pPr>
       <w:r>
         <w:t>Xây dựng</w:t>
@@ -5084,6 +5058,9 @@
     <w:p>
       <w:pPr>
         <w:pStyle w:val="Heading4"/>
+        <w:rPr>
+          <w:rFonts w:hint="eastAsia"/>
+        </w:rPr>
       </w:pPr>
       <w:r>
         <w:t xml:space="preserve">Thêm icon cho phần mềm </w:t>
@@ -5123,6 +5100,9 @@
         <w:keepNext/>
       </w:pPr>
       <w:r>
+        <w:rPr>
+          <w:noProof/>
+        </w:rPr>
         <w:drawing>
           <wp:inline distT="0" distB="0" distL="0" distR="0" wp14:anchorId="3AF3B0A2" wp14:editId="4499113E">
             <wp:extent cx="3657600" cy="2299630"/>
@@ -5224,6 +5204,9 @@
         <w:keepNext/>
       </w:pPr>
       <w:r>
+        <w:rPr>
+          <w:noProof/>
+        </w:rPr>
         <w:drawing>
           <wp:inline distT="0" distB="0" distL="0" distR="0" wp14:anchorId="197B6006" wp14:editId="136095F1">
             <wp:extent cx="4618794" cy="1866900"/>
@@ -5347,6 +5330,9 @@
         <w:keepNext/>
       </w:pPr>
       <w:r>
+        <w:rPr>
+          <w:noProof/>
+        </w:rPr>
         <w:drawing>
           <wp:inline distT="0" distB="0" distL="0" distR="0" wp14:anchorId="5B23FC4A" wp14:editId="35EA31C6">
             <wp:extent cx="4902200" cy="3594100"/>
@@ -10222,6 +10208,7 @@
   <w:style w:type="character" w:default="1" w:styleId="DefaultParagraphFont">
     <w:name w:val="Default Paragraph Font"/>
     <w:uiPriority w:val="1"/>
+    <w:semiHidden/>
     <w:unhideWhenUsed/>
   </w:style>
   <w:style w:type="table" w:default="1" w:styleId="TableNormal">

</xml_diff>